<commit_message>
Clean Paper 4 APPRE v0.1.1 public manuscript artifacts
</commit_message>
<xml_diff>
--- a/manuscripts/paper4/final/Paper-4_APPRE_Schema-and-Rules-Framework_Complex-Neurovascular-Disease_v0.1.1.docx
+++ b/manuscripts/paper4/final/Paper-4_APPRE_Schema-and-Rules-Framework_Complex-Neurovascular-Disease_v0.1.1.docx
@@ -49,24 +49,6 @@
       </w:r>
     </w:p>
     <w:p/>
-    <w:p>
-      <w:pPr>
-        <w:spacing w:after="120" w:line="259" w:lineRule="auto"/>
-      </w:pPr>
-      <w:r>
-        <w:rPr>
-          <w:rFonts w:ascii="Times New Roman" w:hAnsi="Times New Roman" w:eastAsia="Times New Roman"/>
-          <w:b/>
-        </w:rPr>
-        <w:t>Version:</w:t>
-      </w:r>
-      <w:r>
-        <w:rPr>
-          <w:rFonts w:ascii="Times New Roman" w:hAnsi="Times New Roman" w:eastAsia="Times New Roman"/>
-        </w:rPr>
-        <w:t xml:space="preserve"> v0.1.1</w:t>
-      </w:r>
-    </w:p>
     <w:p>
       <w:pPr>
         <w:spacing w:after="120" w:line="259" w:lineRule="auto"/>
@@ -119,42 +101,6 @@
           <w:rFonts w:ascii="Times New Roman" w:hAnsi="Times New Roman" w:eastAsia="Times New Roman"/>
         </w:rPr>
         <w:t xml:space="preserve"> RAY-VASC Regenerative Loop Research Program</w:t>
-      </w:r>
-    </w:p>
-    <w:p>
-      <w:pPr>
-        <w:spacing w:after="120" w:line="259" w:lineRule="auto"/>
-      </w:pPr>
-      <w:r>
-        <w:rPr>
-          <w:rFonts w:ascii="Times New Roman" w:hAnsi="Times New Roman" w:eastAsia="Times New Roman"/>
-          <w:b/>
-        </w:rPr>
-        <w:t>Status:</w:t>
-      </w:r>
-      <w:r>
-        <w:rPr>
-          <w:rFonts w:ascii="Times New Roman" w:hAnsi="Times New Roman" w:eastAsia="Times New Roman"/>
-        </w:rPr>
-        <w:t xml:space="preserve"> Public-facing final manuscript for OSF/Git release and journal-target adaptation</w:t>
-      </w:r>
-    </w:p>
-    <w:p>
-      <w:pPr>
-        <w:spacing w:after="120" w:line="259" w:lineRule="auto"/>
-      </w:pPr>
-      <w:r>
-        <w:rPr>
-          <w:rFonts w:ascii="Times New Roman" w:hAnsi="Times New Roman" w:eastAsia="Times New Roman"/>
-          <w:b/>
-        </w:rPr>
-        <w:t>Changelog:</w:t>
-      </w:r>
-      <w:r>
-        <w:rPr>
-          <w:rFonts w:ascii="Times New Roman" w:hAnsi="Times New Roman" w:eastAsia="Times New Roman"/>
-        </w:rPr>
-        <w:t xml:space="preserve"> v0.1.1 incorporates a worked synthetic APPRE cycle, RAY-VASC implementation cadence, interpretable-window defaults, small-series aggregation logic, minimal FAIR profile, security/privacy safeguards, behaviorome-to-responseome framing, synthetic-data release mechanics, signal-plot boundaries, future APPRE software/AI pathway, and downstream longevity-stack positioning while preserving APPRE as a research-data architecture rather than validated artificial intelligence, clinical decision support, a medical device, or a treatment optimizer.</w:t>
       </w:r>
     </w:p>
     <w:p>
@@ -13231,7 +13177,7 @@
         <w:rPr>
           <w:rFonts w:ascii="Times New Roman" w:hAnsi="Times New Roman" w:eastAsia="Times New Roman"/>
         </w:rPr>
-        <w:t>Controlled-substance exposure is outside APPRE's candidate-input configuration scope. If such exposure appears in a lawful clinician-governed research setting, APPRE may document it only as as-administered observational data. APPRE does not recommend, adjust, tune, optimize, select, increase, decrease, cycle, or personalize controlled-substance exposure.</w:t>
+        <w:t>Controlled-substance exposure is outside APPRE optimization scope. If such exposure appears in a lawful clinician-governed research setting, APPRE may document it only as as-administered observational data. APPRE does not recommend, adjust, tune, optimize, select, increase, decrease, cycle, or personalize controlled-substance exposure.</w:t>
       </w:r>
     </w:p>
     <w:p>
@@ -14611,7 +14557,7 @@
         <w:rFonts w:ascii="Times New Roman" w:hAnsi="Times New Roman"/>
         <w:sz w:val="16"/>
       </w:rPr>
-      <w:t>RAY-VASC Regenerative Loop Research Program | Paper 4 | APPRE v0.1.1</w:t>
+      <w:t>RAY-VASC Regenerative Loop Research Program | Paper 4 | APPRE</w:t>
     </w:r>
   </w:p>
 </w:hdr>

</xml_diff>